<commit_message>
add output of Lors
</commit_message>
<xml_diff>
--- a/Lab 3/Output of code.docx
+++ b/Lab 3/Output of code.docx
@@ -22,13 +22,7 @@
     </w:p>
     <w:p>
       <w:r>
-        <w:t xml:space="preserve">You are </w:t>
-      </w:r>
-      <w:r>
-        <w:t>eligible</w:t>
-      </w:r>
-      <w:r>
-        <w:t xml:space="preserve"> for the Voting in the Nepal</w:t>
+        <w:t>You are eligible for the Voting in the Nepal</w:t>
       </w:r>
     </w:p>
     <w:p>
@@ -51,10 +45,7 @@
       </w:r>
       <w:proofErr w:type="spellEnd"/>
       <w:r>
-        <w:t xml:space="preserve"> eligible</w:t>
-      </w:r>
-      <w:r>
-        <w:t xml:space="preserve"> for the voting in the Nepal</w:t>
+        <w:t xml:space="preserve"> eligible for the voting in the Nepal</w:t>
       </w:r>
     </w:p>
     <w:p/>
@@ -186,6 +177,104 @@
         <w:t xml:space="preserve"> 2</w:t>
       </w:r>
     </w:p>
+    <w:p/>
+    <w:p>
+      <w:r>
+        <w:rPr>
+          <w:highlight w:val="yellow"/>
+        </w:rPr>
+        <w:t xml:space="preserve">Qn </w:t>
+      </w:r>
+      <w:r>
+        <w:rPr>
+          <w:highlight w:val="yellow"/>
+        </w:rPr>
+        <w:t>4</w:t>
+      </w:r>
+      <w:r>
+        <w:rPr>
+          <w:highlight w:val="yellow"/>
+        </w:rPr>
+        <w:t>: Output</w:t>
+      </w:r>
+      <w:r>
+        <w:t xml:space="preserve"> </w:t>
+      </w:r>
+    </w:p>
+    <w:p>
+      <w:r>
+        <w:t xml:space="preserve">Enter the two </w:t>
+      </w:r>
+      <w:proofErr w:type="gramStart"/>
+      <w:r>
+        <w:t>number :</w:t>
+      </w:r>
+      <w:proofErr w:type="gramEnd"/>
+      <w:r>
+        <w:t xml:space="preserve"> </w:t>
+      </w:r>
+    </w:p>
+    <w:p>
+      <w:r>
+        <w:lastRenderedPageBreak/>
+        <w:t>1</w:t>
+      </w:r>
+    </w:p>
+    <w:p>
+      <w:r>
+        <w:t>2</w:t>
+      </w:r>
+    </w:p>
+    <w:p>
+      <w:r>
+        <w:t xml:space="preserve"> </w:t>
+      </w:r>
+      <w:proofErr w:type="spellStart"/>
+      <w:r>
+        <w:t>Lagrest</w:t>
+      </w:r>
+      <w:proofErr w:type="spellEnd"/>
+      <w:r>
+        <w:t xml:space="preserve"> </w:t>
+      </w:r>
+      <w:proofErr w:type="gramStart"/>
+      <w:r>
+        <w:t>one :</w:t>
+      </w:r>
+      <w:proofErr w:type="gramEnd"/>
+      <w:r>
+        <w:t xml:space="preserve"> 2</w:t>
+      </w:r>
+    </w:p>
+    <w:p>
+      <w:r>
+        <w:t xml:space="preserve">Enter the two </w:t>
+      </w:r>
+      <w:proofErr w:type="gramStart"/>
+      <w:r>
+        <w:t>number :</w:t>
+      </w:r>
+      <w:proofErr w:type="gramEnd"/>
+      <w:r>
+        <w:t xml:space="preserve"> </w:t>
+      </w:r>
+    </w:p>
+    <w:p>
+      <w:r>
+        <w:t>2</w:t>
+      </w:r>
+    </w:p>
+    <w:p>
+      <w:r>
+        <w:t>2</w:t>
+      </w:r>
+    </w:p>
+    <w:p>
+      <w:r>
+        <w:t>Both is equal : 2 and 2</w:t>
+      </w:r>
+    </w:p>
+    <w:p/>
     <w:p/>
     <w:sectPr>
       <w:pgSz w:w="11906" w:h="16838"/>

</xml_diff>

<commit_message>
Add output of display.cpp
</commit_message>
<xml_diff>
--- a/Lab 3/Output of code.docx
+++ b/Lab 3/Output of code.docx
@@ -275,6 +275,54 @@
       </w:r>
     </w:p>
     <w:p/>
+    <w:p>
+      <w:r>
+        <w:rPr>
+          <w:highlight w:val="yellow"/>
+        </w:rPr>
+        <w:t xml:space="preserve">Qn </w:t>
+      </w:r>
+      <w:r>
+        <w:rPr>
+          <w:highlight w:val="yellow"/>
+        </w:rPr>
+        <w:t>5</w:t>
+      </w:r>
+      <w:r>
+        <w:rPr>
+          <w:highlight w:val="yellow"/>
+        </w:rPr>
+        <w:t>: Output</w:t>
+      </w:r>
+      <w:r>
+        <w:t xml:space="preserve"> </w:t>
+      </w:r>
+    </w:p>
+    <w:p>
+      <w:r>
+        <w:t xml:space="preserve">Enter the three number </w:t>
+      </w:r>
+    </w:p>
+    <w:p>
+      <w:r>
+        <w:t>3443455</w:t>
+      </w:r>
+    </w:p>
+    <w:p>
+      <w:r>
+        <w:t>989</w:t>
+      </w:r>
+    </w:p>
+    <w:p>
+      <w:r>
+        <w:t>12</w:t>
+      </w:r>
+    </w:p>
+    <w:p>
+      <w:r>
+        <w:t>Middle number: 989</w:t>
+      </w:r>
+    </w:p>
     <w:p/>
     <w:sectPr>
       <w:pgSz w:w="11906" w:h="16838"/>

</xml_diff>

<commit_message>
Add output of VorC.cpp
</commit_message>
<xml_diff>
--- a/Lab 3/Output of code.docx
+++ b/Lab 3/Output of code.docx
@@ -321,6 +321,50 @@
     <w:p>
       <w:r>
         <w:t>Middle number: 989</w:t>
+      </w:r>
+    </w:p>
+    <w:p/>
+    <w:p>
+      <w:r>
+        <w:rPr>
+          <w:highlight w:val="yellow"/>
+        </w:rPr>
+        <w:t xml:space="preserve">Qn </w:t>
+      </w:r>
+      <w:r>
+        <w:rPr>
+          <w:highlight w:val="yellow"/>
+        </w:rPr>
+        <w:t>6</w:t>
+      </w:r>
+      <w:r>
+        <w:rPr>
+          <w:highlight w:val="yellow"/>
+        </w:rPr>
+        <w:t>: Output</w:t>
+      </w:r>
+      <w:r>
+        <w:t xml:space="preserve"> </w:t>
+      </w:r>
+    </w:p>
+    <w:p>
+      <w:r>
+        <w:t>Enter a character: q</w:t>
+      </w:r>
+    </w:p>
+    <w:p>
+      <w:r>
+        <w:t>It is a consonant.</w:t>
+      </w:r>
+    </w:p>
+    <w:p>
+      <w:r>
+        <w:t>Enter a character: a</w:t>
+      </w:r>
+    </w:p>
+    <w:p>
+      <w:r>
+        <w:t>It is a vowel.</w:t>
       </w:r>
     </w:p>
     <w:p/>

</xml_diff>